<commit_message>
Check failure-prediction refs against full text and expand 3.2.5.4
Co-Authored-By: Claude Opus 5.5 <noreply@anthropic.com>
Claude-Session: https://claude.ai/code/session_01KrVvuWxDmBDGvHTuGVMuit
</commit_message>
<xml_diff>
--- a/literature-review/Section_3.2.4-3.2.5_Comparison_and_Robustness.docx
+++ b/literature-review/Section_3.2.4-3.2.5_Comparison_and_Robustness.docx
@@ -2489,7 +2489,7 @@
           <w:sz w:val="22"/>
           <w:szCs w:val="22"/>
         </w:rPr>
-        <w:t xml:space="preserve"> PD patterns change with test voltage and with ageing [2], and neural networks may assign patterns they were not trained on to a known class [3].</w:t>
+        <w:t xml:space="preserve"> PD patterns change with test voltage and with ageing [2], and neural networks may assign patterns they were not trained on to a known class [3]. Testing at conditions not seen in training is therefore informative: Sahoo and Karmakar trained on 1 500 PRPD images recorded at 12 kV and tested on 300 images recorded at 11 kV and 14 kV [13].</w:t>
       </w:r>
     </w:p>
     <w:p>
@@ -2520,7 +2520,97 @@
           <w:sz w:val="22"/>
           <w:szCs w:val="22"/>
         </w:rPr>
-        <w:t xml:space="preserve">Classification describes the current state of the insulation; failure prediction requires tracking how PD changes over time. PD distributions change significantly as insulation ages, and this has been used to assess the degree of degradation [2]. Recent studies have used deep learning to classify the growth stage of electrical trees in XLPE from PRPD patterns up to breakdown [14], and to forecast a PD-based failure precursor several steps ahead with an LSTM for insulation-condition forewarning in machine windings [13]. These studies used accelerated-ageing tests in which specimens were followed over time. Such data will be needed before failure prediction can be attempted in this project, and this direction will be investigated further during the remainder of the semester.</w:t>
+        <w:t xml:space="preserve">Classification describes the current state of the insulation; failure prediction requires tracking how PD changes over time. PD distributions change significantly as insulation ages, and this has been used to assess the degree of degradation [2]. Two recent studies show how deep learning can be extended in this direction.</w:t>
+      </w:r>
+    </w:p>
+    <w:p>
+      <w:pPr>
+        <w:pStyle w:val="ListParagraph"/>
+        <w:numPr>
+          <w:ilvl w:val="0"/>
+          <w:numId w:val="2"/>
+        </w:numPr>
+        <w:spacing w:after="80" w:line="276"/>
+        <w:jc w:val="both"/>
+      </w:pPr>
+      <w:r>
+        <w:rPr>
+          <w:rFonts w:ascii="Calibri" w:cs="Calibri" w:eastAsia="Calibri" w:hAnsi="Calibri"/>
+          <w:b/>
+          <w:bCs/>
+          <w:sz w:val="22"/>
+          <w:szCs w:val="22"/>
+        </w:rPr>
+        <w:t xml:space="preserve">Classifying the stage of degradation.</w:t>
+      </w:r>
+      <w:r>
+        <w:rPr>
+          <w:rFonts w:ascii="Calibri" w:cs="Calibri" w:eastAsia="Calibri" w:hAnsi="Calibri"/>
+          <w:sz w:val="22"/>
+          <w:szCs w:val="22"/>
+        </w:rPr>
+        <w:t xml:space="preserve"> Sahoo and Karmakar grew electrical trees from a needle electrode in XLPE samples cut from a 19/33 kV cable. At 12 kV, tree growth passed through a fast-growth phase up to 120 min (6.47 µm/min, maximum PD 120 pC), a slow-growth phase from 120 to 210 min (1.62 µm/min, 189 pC) and a breakdown phase after 210 min (6.9 µm/min, 234 pC). PRPD images of the three stages were classified with 98.44% accuracy by a CNN and 99.78% by a pretrained DenseNet201 [13]. Here, failure prediction becomes a classification problem in which the classes are severity stages rather than defect types.</w:t>
+      </w:r>
+    </w:p>
+    <w:p>
+      <w:pPr>
+        <w:pStyle w:val="ListParagraph"/>
+        <w:numPr>
+          <w:ilvl w:val="0"/>
+          <w:numId w:val="2"/>
+        </w:numPr>
+        <w:spacing w:after="80" w:line="276"/>
+        <w:jc w:val="both"/>
+      </w:pPr>
+      <w:r>
+        <w:rPr>
+          <w:rFonts w:ascii="Calibri" w:cs="Calibri" w:eastAsia="Calibri" w:hAnsi="Calibri"/>
+          <w:b/>
+          <w:bCs/>
+          <w:sz w:val="22"/>
+          <w:szCs w:val="22"/>
+        </w:rPr>
+        <w:t xml:space="preserve">Forecasting a failure precursor.</w:t>
+      </w:r>
+      <w:r>
+        <w:rPr>
+          <w:rFonts w:ascii="Calibri" w:cs="Calibri" w:eastAsia="Calibri" w:hAnsi="Calibri"/>
+          <w:sz w:val="22"/>
+          <w:szCs w:val="22"/>
+        </w:rPr>
+        <w:t xml:space="preserve"> Wang </w:t>
+      </w:r>
+      <w:r>
+        <w:rPr>
+          <w:rFonts w:ascii="Calibri" w:cs="Calibri" w:eastAsia="Calibri" w:hAnsi="Calibri"/>
+          <w:i/>
+          <w:iCs/>
+          <w:sz w:val="22"/>
+          <w:szCs w:val="22"/>
+        </w:rPr>
+        <w:t xml:space="preserve">et al.</w:t>
+      </w:r>
+      <w:r>
+        <w:rPr>
+          <w:rFonts w:ascii="Calibri" w:cs="Calibri" w:eastAsia="Calibri" w:hAnsi="Calibri"/>
+          <w:sz w:val="22"/>
+          <w:szCs w:val="22"/>
+        </w:rPr>
+        <w:t xml:space="preserve"> aged machine-winding insulation at 240 °C and 0.2 atm under five voltages (2 000–2 800 V rms, five samples each) and measured PD with an HFCT every second until failure. The apparent charge, PD count and phase interval per cycle were combined by an autoencoder into one failure precursor, and an LSTM used the previous 50 values to predict the next 50, a 50 s warning margin. The maximum mean absolute error was about 3%, around half that of ARIMA and SVM, although the SVM was more accurate at one ageing voltage (2 200 V) [14].</w:t>
+      </w:r>
+    </w:p>
+    <w:p>
+      <w:pPr>
+        <w:spacing w:after="140" w:line="276"/>
+        <w:jc w:val="both"/>
+      </w:pPr>
+      <w:r>
+        <w:rPr>
+          <w:rFonts w:ascii="Calibri" w:cs="Calibri" w:eastAsia="Calibri" w:hAnsi="Calibri"/>
+          <w:sz w:val="22"/>
+          <w:szCs w:val="22"/>
+        </w:rPr>
+        <w:t xml:space="preserve">Both studies required specimens to be measured repeatedly until breakdown in accelerated-ageing tests. Such run-to-failure data will be needed before failure prediction can be attempted in this project, and this direction will be investigated further during the remainder of the semester.</w:t>
       </w:r>
     </w:p>
     <w:p>
@@ -2618,7 +2708,7 @@
         </w:rPr>
         <w:t xml:space="preserve"> </w:t>
       </w:r>
-      <w:hyperlink w:history="1" r:id="rIdukxlnawac_9se9ge5klrv">
+      <w:hyperlink w:history="1" r:id="rIdnumcljjzdwi059qupyah8">
         <w:r>
           <w:rPr>
             <w:rStyle w:val="Hyperlink"/>
@@ -2677,7 +2767,7 @@
         </w:rPr>
         <w:t xml:space="preserve"> </w:t>
       </w:r>
-      <w:hyperlink w:history="1" r:id="rIdjc35wrsw-y1zkksin2yds">
+      <w:hyperlink w:history="1" r:id="rIdde-kfmofrkyxpg0leekx3">
         <w:r>
           <w:rPr>
             <w:rStyle w:val="Hyperlink"/>
@@ -2736,7 +2826,7 @@
         </w:rPr>
         <w:t xml:space="preserve"> </w:t>
       </w:r>
-      <w:hyperlink w:history="1" r:id="rIdhmxvfdszs-t8unlzjypuf">
+      <w:hyperlink w:history="1" r:id="rId1ps0l36nizghiejn4scaj">
         <w:r>
           <w:rPr>
             <w:rStyle w:val="Hyperlink"/>
@@ -2795,7 +2885,7 @@
         </w:rPr>
         <w:t xml:space="preserve"> </w:t>
       </w:r>
-      <w:hyperlink w:history="1" r:id="rIdqx90j8azzdc8xn3uwn1si">
+      <w:hyperlink w:history="1" r:id="rIddpycz6ag_vdhlt0qszlhq">
         <w:r>
           <w:rPr>
             <w:rStyle w:val="Hyperlink"/>
@@ -2872,7 +2962,7 @@
         </w:rPr>
         <w:t xml:space="preserve"> </w:t>
       </w:r>
-      <w:hyperlink w:history="1" r:id="rIdmnwkrdjrswkd7cddpghtf">
+      <w:hyperlink w:history="1" r:id="rIdj6d6lll0_bbdrgf1ldnyt">
         <w:r>
           <w:rPr>
             <w:rStyle w:val="Hyperlink"/>
@@ -2949,7 +3039,7 @@
         </w:rPr>
         <w:t xml:space="preserve"> </w:t>
       </w:r>
-      <w:hyperlink w:history="1" r:id="rId4o3rqcejazatddlza836f">
+      <w:hyperlink w:history="1" r:id="rIdj_b1020vp5eqkxfvh1ibu">
         <w:r>
           <w:rPr>
             <w:rStyle w:val="Hyperlink"/>
@@ -3008,7 +3098,7 @@
         </w:rPr>
         <w:t xml:space="preserve"> </w:t>
       </w:r>
-      <w:hyperlink w:history="1" r:id="rIdkcu_qbatshes6-wvkx4dc">
+      <w:hyperlink w:history="1" r:id="rIdkdkvkcoiautiavqzy4qtn">
         <w:r>
           <w:rPr>
             <w:rStyle w:val="Hyperlink"/>
@@ -3085,7 +3175,7 @@
         </w:rPr>
         <w:t xml:space="preserve"> </w:t>
       </w:r>
-      <w:hyperlink w:history="1" r:id="rIdbn9s7onq9xbvvw-znf77n">
+      <w:hyperlink w:history="1" r:id="rIda3q3llann-su4lx5biguo">
         <w:r>
           <w:rPr>
             <w:rStyle w:val="Hyperlink"/>
@@ -3144,7 +3234,7 @@
         </w:rPr>
         <w:t xml:space="preserve"> </w:t>
       </w:r>
-      <w:hyperlink w:history="1" r:id="rIdpdoij-h11lnj03m5cs0s_">
+      <w:hyperlink w:history="1" r:id="rIdqfngcvueyfwyshfsa8jce">
         <w:r>
           <w:rPr>
             <w:rStyle w:val="Hyperlink"/>
@@ -3221,7 +3311,7 @@
         </w:rPr>
         <w:t xml:space="preserve"> </w:t>
       </w:r>
-      <w:hyperlink w:history="1" r:id="rIdn3vupdii3zaozxukz8lgo">
+      <w:hyperlink w:history="1" r:id="rIdvgpdpja1dlgbve_3bbm3u">
         <w:r>
           <w:rPr>
             <w:rStyle w:val="Hyperlink"/>
@@ -3252,7 +3342,7 @@
           <w:sz w:val="22"/>
           <w:szCs w:val="22"/>
         </w:rPr>
-        <w:t xml:space="preserve">Y. Wang, J. Wu, T. Han, K. Haran, and Y. Yin, “Insulation condition forewarning of form-wound winding for electric aircraft propulsion based on partial discharge and deep learning neural network,” </w:t>
+        <w:t xml:space="preserve">R. Sahoo and S. Karmakar, “Investigation of electrical tree growth characteristics and partial discharge pattern analysis using deep neural network,” </w:t>
       </w:r>
       <w:r>
         <w:rPr>
@@ -3262,6 +3352,65 @@
           <w:sz w:val="22"/>
           <w:szCs w:val="22"/>
         </w:rPr>
+        <w:t xml:space="preserve">Electr. Power Syst. Res.</w:t>
+      </w:r>
+      <w:r>
+        <w:rPr>
+          <w:rFonts w:ascii="Calibri" w:cs="Calibri" w:eastAsia="Calibri" w:hAnsi="Calibri"/>
+          <w:sz w:val="22"/>
+          <w:szCs w:val="22"/>
+        </w:rPr>
+        <w:t xml:space="preserve">, vol. 220, 109287, 2023.</w:t>
+      </w:r>
+      <w:r>
+        <w:rPr>
+          <w:rFonts w:ascii="Calibri" w:cs="Calibri" w:eastAsia="Calibri" w:hAnsi="Calibri"/>
+          <w:sz w:val="22"/>
+          <w:szCs w:val="22"/>
+        </w:rPr>
+        <w:t xml:space="preserve"> </w:t>
+      </w:r>
+      <w:hyperlink w:history="1" r:id="rId_rnmubypg8bgpure0msre">
+        <w:r>
+          <w:rPr>
+            <w:rStyle w:val="Hyperlink"/>
+            <w:rFonts w:ascii="Calibri" w:cs="Calibri" w:eastAsia="Calibri" w:hAnsi="Calibri"/>
+            <w:sz w:val="22"/>
+            <w:szCs w:val="22"/>
+          </w:rPr>
+          <w:t xml:space="preserve">https://doi.org/10.1016/j.epsr.2023.109287</w:t>
+        </w:r>
+      </w:hyperlink>
+    </w:p>
+    <w:p>
+      <w:pPr>
+        <w:spacing w:after="100"/>
+        <w:ind w:left="500" w:hanging="500"/>
+      </w:pPr>
+      <w:r>
+        <w:rPr>
+          <w:rFonts w:ascii="Calibri" w:cs="Calibri" w:eastAsia="Calibri" w:hAnsi="Calibri"/>
+          <w:sz w:val="22"/>
+          <w:szCs w:val="22"/>
+        </w:rPr>
+        <w:t xml:space="preserve">[14]	</w:t>
+      </w:r>
+      <w:r>
+        <w:rPr>
+          <w:rFonts w:ascii="Calibri" w:cs="Calibri" w:eastAsia="Calibri" w:hAnsi="Calibri"/>
+          <w:sz w:val="22"/>
+          <w:szCs w:val="22"/>
+        </w:rPr>
+        <w:t xml:space="preserve">Y. Wang, J. Wu, T. Han, K. Haran, and Y. Yin, “Insulation condition forewarning of form-wound winding for electric aircraft propulsion based on partial discharge and deep learning neural network,” </w:t>
+      </w:r>
+      <w:r>
+        <w:rPr>
+          <w:rFonts w:ascii="Calibri" w:cs="Calibri" w:eastAsia="Calibri" w:hAnsi="Calibri"/>
+          <w:i/>
+          <w:iCs/>
+          <w:sz w:val="22"/>
+          <w:szCs w:val="22"/>
+        </w:rPr>
         <w:t xml:space="preserve">High Voltage</w:t>
       </w:r>
       <w:r>
@@ -3280,7 +3429,7 @@
         </w:rPr>
         <w:t xml:space="preserve"> </w:t>
       </w:r>
-      <w:hyperlink w:history="1" r:id="rIdfg8r7h9pfkhy5shmmpkyq">
+      <w:hyperlink w:history="1" r:id="rIdpyxile1tiyu1lvo66gski">
         <w:r>
           <w:rPr>
             <w:rStyle w:val="Hyperlink"/>
@@ -3289,65 +3438,6 @@
             <w:szCs w:val="22"/>
           </w:rPr>
           <w:t xml:space="preserve">https://doi.org/10.1049/hve2.12034</w:t>
-        </w:r>
-      </w:hyperlink>
-    </w:p>
-    <w:p>
-      <w:pPr>
-        <w:spacing w:after="100"/>
-        <w:ind w:left="500" w:hanging="500"/>
-      </w:pPr>
-      <w:r>
-        <w:rPr>
-          <w:rFonts w:ascii="Calibri" w:cs="Calibri" w:eastAsia="Calibri" w:hAnsi="Calibri"/>
-          <w:sz w:val="22"/>
-          <w:szCs w:val="22"/>
-        </w:rPr>
-        <w:t xml:space="preserve">[14]	</w:t>
-      </w:r>
-      <w:r>
-        <w:rPr>
-          <w:rFonts w:ascii="Calibri" w:cs="Calibri" w:eastAsia="Calibri" w:hAnsi="Calibri"/>
-          <w:sz w:val="22"/>
-          <w:szCs w:val="22"/>
-        </w:rPr>
-        <w:t xml:space="preserve">R. Sahoo and S. Karmakar, “Investigation of electrical tree growth characteristics and partial discharge pattern analysis using deep neural network,” </w:t>
-      </w:r>
-      <w:r>
-        <w:rPr>
-          <w:rFonts w:ascii="Calibri" w:cs="Calibri" w:eastAsia="Calibri" w:hAnsi="Calibri"/>
-          <w:i/>
-          <w:iCs/>
-          <w:sz w:val="22"/>
-          <w:szCs w:val="22"/>
-        </w:rPr>
-        <w:t xml:space="preserve">Electr. Power Syst. Res.</w:t>
-      </w:r>
-      <w:r>
-        <w:rPr>
-          <w:rFonts w:ascii="Calibri" w:cs="Calibri" w:eastAsia="Calibri" w:hAnsi="Calibri"/>
-          <w:sz w:val="22"/>
-          <w:szCs w:val="22"/>
-        </w:rPr>
-        <w:t xml:space="preserve">, vol. 220, 109287, 2023.</w:t>
-      </w:r>
-      <w:r>
-        <w:rPr>
-          <w:rFonts w:ascii="Calibri" w:cs="Calibri" w:eastAsia="Calibri" w:hAnsi="Calibri"/>
-          <w:sz w:val="22"/>
-          <w:szCs w:val="22"/>
-        </w:rPr>
-        <w:t xml:space="preserve"> </w:t>
-      </w:r>
-      <w:hyperlink w:history="1" r:id="rIdcoeigvdyzpianual-q_j8">
-        <w:r>
-          <w:rPr>
-            <w:rStyle w:val="Hyperlink"/>
-            <w:rFonts w:ascii="Calibri" w:cs="Calibri" w:eastAsia="Calibri" w:hAnsi="Calibri"/>
-            <w:sz w:val="22"/>
-            <w:szCs w:val="22"/>
-          </w:rPr>
-          <w:t xml:space="preserve">https://doi.org/10.1016/j.epsr.2023.109287</w:t>
         </w:r>
       </w:hyperlink>
     </w:p>

</xml_diff>

<commit_message>
Reword 3.2.4-3.2.5 so experiments are planned for next semester
Co-Authored-By: Claude Opus 5.5 <noreply@anthropic.com>
Claude-Session: https://claude.ai/code/session_01KrVvuWxDmBDGvHTuGVMuit
</commit_message>
<xml_diff>
--- a/literature-review/Section_3.2.4-3.2.5_Comparison_and_Robustness.docx
+++ b/literature-review/Section_3.2.4-3.2.5_Comparison_and_Robustness.docx
@@ -30,7 +30,7 @@
           <w:sz w:val="22"/>
           <w:szCs w:val="22"/>
         </w:rPr>
-        <w:t xml:space="preserve">Sections 3.2.2 and 3.2.3 reviewed traditional and deep-learning classifiers. This section compares them as candidates for the project. At this mid-semester stage the comparison is based on the literature only; the final choice of input representation and model will be made later in the project, after the available data have been audited and baseline experiments have been run.</w:t>
+        <w:t xml:space="preserve">Sections 3.2.2 and 3.2.3 reviewed traditional and deep-learning classifiers. This section compares them as candidates for the project. At this mid-semester stage the comparison is based on the literature only. No experimental data will be collected until next semester, so the final choice of input representation and model will be made then, once laboratory data are available and baseline models can be trained.</w:t>
       </w:r>
     </w:p>
     <w:p>
@@ -1971,7 +1971,7 @@
           <w:sz w:val="22"/>
           <w:szCs w:val="22"/>
         </w:rPr>
-        <w:t xml:space="preserve"> Based on this review, the approaches to be carried forward for experimental comparison are: an SVM and a random forest on hand-crafted features as baselines, a compact 1D CNN on raw HFCT pulses, and a compact 2D CNN on PRPD patterns if a phase reference is available. An LSTM and a pretrained or Transformer model remain optional extensions. This shortlist will be revised once the dataset inventory is complete, and the final method will be selected on the basis of the project’s own experiments rather than published accuracy figures.</w:t>
+        <w:t xml:space="preserve"> Based on this review, the approaches to be carried forward to the experimental phase next semester are: an SVM and a random forest on hand-crafted features as baselines, a compact 1D CNN on raw HFCT pulses, and a compact 2D CNN on PRPD patterns if a phase reference is available. An LSTM and a pretrained or Transformer model remain optional extensions. This shortlist will be revised as the review continues and once the measurement setup and the classes that can be produced in the laboratory are confirmed; the final method will be selected next semester on the basis of the project’s own experiments rather than published accuracy figures.</w:t>
       </w:r>
     </w:p>
     <w:p>
@@ -2190,7 +2190,7 @@
           <w:sz w:val="22"/>
           <w:szCs w:val="22"/>
         </w:rPr>
-        <w:t xml:space="preserve"> list noise as future work [5], [12]. Robustness to noise is therefore an open question for the deep-learning candidates and will be tested in this project with background recordings from the laboratory.</w:t>
+        <w:t xml:space="preserve"> list noise as future work [5], [12]. Robustness to noise is therefore an open question for the deep-learning candidates and will be tested next semester with background recordings from the laboratory.</w:t>
       </w:r>
     </w:p>
     <w:p>
@@ -2610,7 +2610,7 @@
           <w:sz w:val="22"/>
           <w:szCs w:val="22"/>
         </w:rPr>
-        <w:t xml:space="preserve">Both studies required specimens to be measured repeatedly until breakdown in accelerated-ageing tests. Such run-to-failure data will be needed before failure prediction can be attempted in this project, and this direction will be investigated further during the remainder of the semester.</w:t>
+        <w:t xml:space="preserve">Both studies required specimens to be measured repeatedly until breakdown in accelerated-ageing tests. Such run-to-failure data would have to be collected during the experimental phase next semester; the remainder of this semester will be used to review this direction further and to assess whether such tests are feasible with the laboratory setup.</w:t>
       </w:r>
     </w:p>
     <w:p>
@@ -2641,7 +2641,7 @@
           <w:sz w:val="22"/>
           <w:szCs w:val="22"/>
         </w:rPr>
-        <w:t xml:space="preserve">The review leads to a provisional evaluation plan, to be refined as the work progresses: record the specimen and session of every measurement and split the data by these groups; report per-class and macro-averaged metrics with confusion matrices; test all candidate models on the same split and with real laboratory background noise; evaluate an “unknown” output for low-confidence cases; and, where possible, record repeated measurements of the same specimen over time to support the later study of failure prediction.</w:t>
+        <w:t xml:space="preserve">The review leads to a provisional evaluation plan for the experimental phase next semester, to be refined before then: record the specimen and session of every measurement and split the data by these groups; report per-class and macro-averaged metrics with confusion matrices; test all candidate models on the same split and with real laboratory background noise; evaluate an “unknown” output for low-confidence cases; and, where possible, record repeated measurements of the same specimen over time to support the later study of failure prediction.</w:t>
       </w:r>
     </w:p>
     <w:p>
@@ -2708,7 +2708,7 @@
         </w:rPr>
         <w:t xml:space="preserve"> </w:t>
       </w:r>
-      <w:hyperlink w:history="1" r:id="rIdnumcljjzdwi059qupyah8">
+      <w:hyperlink w:history="1" r:id="rIdwg_rr7rszvo1i3ip6tgpz">
         <w:r>
           <w:rPr>
             <w:rStyle w:val="Hyperlink"/>
@@ -2767,7 +2767,7 @@
         </w:rPr>
         <w:t xml:space="preserve"> </w:t>
       </w:r>
-      <w:hyperlink w:history="1" r:id="rIdde-kfmofrkyxpg0leekx3">
+      <w:hyperlink w:history="1" r:id="rIdl0w9vrc8p_panimkv3kc7">
         <w:r>
           <w:rPr>
             <w:rStyle w:val="Hyperlink"/>
@@ -2826,7 +2826,7 @@
         </w:rPr>
         <w:t xml:space="preserve"> </w:t>
       </w:r>
-      <w:hyperlink w:history="1" r:id="rId1ps0l36nizghiejn4scaj">
+      <w:hyperlink w:history="1" r:id="rIdxe-yt2xvjnrbt_9d9wd13">
         <w:r>
           <w:rPr>
             <w:rStyle w:val="Hyperlink"/>
@@ -2885,7 +2885,7 @@
         </w:rPr>
         <w:t xml:space="preserve"> </w:t>
       </w:r>
-      <w:hyperlink w:history="1" r:id="rIddpycz6ag_vdhlt0qszlhq">
+      <w:hyperlink w:history="1" r:id="rId13fpsl3rtikq3v2ighxbj">
         <w:r>
           <w:rPr>
             <w:rStyle w:val="Hyperlink"/>
@@ -2962,7 +2962,7 @@
         </w:rPr>
         <w:t xml:space="preserve"> </w:t>
       </w:r>
-      <w:hyperlink w:history="1" r:id="rIdj6d6lll0_bbdrgf1ldnyt">
+      <w:hyperlink w:history="1" r:id="rIdy8mma9r4pcxbu-xrwsurh">
         <w:r>
           <w:rPr>
             <w:rStyle w:val="Hyperlink"/>
@@ -3039,7 +3039,7 @@
         </w:rPr>
         <w:t xml:space="preserve"> </w:t>
       </w:r>
-      <w:hyperlink w:history="1" r:id="rIdj_b1020vp5eqkxfvh1ibu">
+      <w:hyperlink w:history="1" r:id="rIdvrccz0gujaq3dofc-xzqm">
         <w:r>
           <w:rPr>
             <w:rStyle w:val="Hyperlink"/>
@@ -3098,7 +3098,7 @@
         </w:rPr>
         <w:t xml:space="preserve"> </w:t>
       </w:r>
-      <w:hyperlink w:history="1" r:id="rIdkdkvkcoiautiavqzy4qtn">
+      <w:hyperlink w:history="1" r:id="rId98egfktgnbrqvmdrgemsi">
         <w:r>
           <w:rPr>
             <w:rStyle w:val="Hyperlink"/>
@@ -3175,7 +3175,7 @@
         </w:rPr>
         <w:t xml:space="preserve"> </w:t>
       </w:r>
-      <w:hyperlink w:history="1" r:id="rIda3q3llann-su4lx5biguo">
+      <w:hyperlink w:history="1" r:id="rIdhj0vxp2r12pth5lhpqrwp">
         <w:r>
           <w:rPr>
             <w:rStyle w:val="Hyperlink"/>
@@ -3234,7 +3234,7 @@
         </w:rPr>
         <w:t xml:space="preserve"> </w:t>
       </w:r>
-      <w:hyperlink w:history="1" r:id="rIdqfngcvueyfwyshfsa8jce">
+      <w:hyperlink w:history="1" r:id="rIdcjzhb6cdmlyq-sgb1msov">
         <w:r>
           <w:rPr>
             <w:rStyle w:val="Hyperlink"/>
@@ -3311,7 +3311,7 @@
         </w:rPr>
         <w:t xml:space="preserve"> </w:t>
       </w:r>
-      <w:hyperlink w:history="1" r:id="rIdvgpdpja1dlgbve_3bbm3u">
+      <w:hyperlink w:history="1" r:id="rIdxs_6ex3j7j8ka3yjaqhfb">
         <w:r>
           <w:rPr>
             <w:rStyle w:val="Hyperlink"/>
@@ -3370,7 +3370,7 @@
         </w:rPr>
         <w:t xml:space="preserve"> </w:t>
       </w:r>
-      <w:hyperlink w:history="1" r:id="rId_rnmubypg8bgpure0msre">
+      <w:hyperlink w:history="1" r:id="rIdaaa2uergbalns8ed5vbx-">
         <w:r>
           <w:rPr>
             <w:rStyle w:val="Hyperlink"/>
@@ -3429,7 +3429,7 @@
         </w:rPr>
         <w:t xml:space="preserve"> </w:t>
       </w:r>
-      <w:hyperlink w:history="1" r:id="rIdpyxile1tiyu1lvo66gski">
+      <w:hyperlink w:history="1" r:id="rIdfn5aauazudexm46w41gk6">
         <w:r>
           <w:rPr>
             <w:rStyle w:val="Hyperlink"/>

</xml_diff>

<commit_message>
State that the final method choice is made at the end of this semester
Co-Authored-By: Claude Opus 5.5 <noreply@anthropic.com>
Claude-Session: https://claude.ai/code/session_01KrVvuWxDmBDGvHTuGVMuit
</commit_message>
<xml_diff>
--- a/literature-review/Section_3.2.4-3.2.5_Comparison_and_Robustness.docx
+++ b/literature-review/Section_3.2.4-3.2.5_Comparison_and_Robustness.docx
@@ -30,7 +30,7 @@
           <w:sz w:val="22"/>
           <w:szCs w:val="22"/>
         </w:rPr>
-        <w:t xml:space="preserve">Sections 3.2.2 and 3.2.3 reviewed traditional and deep-learning classifiers. This section compares them as candidates for the project. At this mid-semester stage the comparison is based on the literature only. No experimental data will be collected until next semester, so the final choice of input representation and model will be made then, once laboratory data are available and baseline models can be trained.</w:t>
+        <w:t xml:space="preserve">Sections 3.2.2 and 3.2.3 reviewed traditional and deep-learning classifiers. This section compares them as candidates for the project. At this mid-semester stage the comparison is preliminary. The final choice of input representation and model will be made at the end of this semester, after a deeper review of the literature; the selected approach will then be implemented and tested experimentally next semester.</w:t>
       </w:r>
     </w:p>
     <w:p>
@@ -1971,7 +1971,7 @@
           <w:sz w:val="22"/>
           <w:szCs w:val="22"/>
         </w:rPr>
-        <w:t xml:space="preserve"> Based on this review, the approaches to be carried forward to the experimental phase next semester are: an SVM and a random forest on hand-crafted features as baselines, a compact 1D CNN on raw HFCT pulses, and a compact 2D CNN on PRPD patterns if a phase reference is available. An LSTM and a pretrained or Transformer model remain optional extensions. This shortlist will be revised as the review continues and once the measurement setup and the classes that can be produced in the laboratory are confirmed; the final method will be selected next semester on the basis of the project’s own experiments rather than published accuracy figures.</w:t>
+        <w:t xml:space="preserve"> Based on this review, the approaches that remain under consideration are: an SVM and a random forest on hand-crafted features as baselines, a compact 1D CNN on raw HFCT pulses, and a compact 2D CNN on PRPD patterns if a phase reference is available. An LSTM and a pretrained or Transformer model remain optional extensions. This shortlist will be narrowed during the rest of the semester as the review is deepened and the measurement setup and the classes that can be produced in the laboratory are confirmed, and the final selection will be made at the end of the semester.</w:t>
       </w:r>
     </w:p>
     <w:p>
@@ -2708,7 +2708,7 @@
         </w:rPr>
         <w:t xml:space="preserve"> </w:t>
       </w:r>
-      <w:hyperlink w:history="1" r:id="rIdwg_rr7rszvo1i3ip6tgpz">
+      <w:hyperlink w:history="1" r:id="rIdeg32-jockp0tem8kdwzc0">
         <w:r>
           <w:rPr>
             <w:rStyle w:val="Hyperlink"/>
@@ -2767,7 +2767,7 @@
         </w:rPr>
         <w:t xml:space="preserve"> </w:t>
       </w:r>
-      <w:hyperlink w:history="1" r:id="rIdl0w9vrc8p_panimkv3kc7">
+      <w:hyperlink w:history="1" r:id="rIdzijhoco-5ok6kebmiorji">
         <w:r>
           <w:rPr>
             <w:rStyle w:val="Hyperlink"/>
@@ -2826,7 +2826,7 @@
         </w:rPr>
         <w:t xml:space="preserve"> </w:t>
       </w:r>
-      <w:hyperlink w:history="1" r:id="rIdxe-yt2xvjnrbt_9d9wd13">
+      <w:hyperlink w:history="1" r:id="rIdgrqhqobs9jtgiqfkatpsc">
         <w:r>
           <w:rPr>
             <w:rStyle w:val="Hyperlink"/>
@@ -2885,7 +2885,7 @@
         </w:rPr>
         <w:t xml:space="preserve"> </w:t>
       </w:r>
-      <w:hyperlink w:history="1" r:id="rId13fpsl3rtikq3v2ighxbj">
+      <w:hyperlink w:history="1" r:id="rIdmb8i9_z358fhy2qc3mb7i">
         <w:r>
           <w:rPr>
             <w:rStyle w:val="Hyperlink"/>
@@ -2962,7 +2962,7 @@
         </w:rPr>
         <w:t xml:space="preserve"> </w:t>
       </w:r>
-      <w:hyperlink w:history="1" r:id="rIdy8mma9r4pcxbu-xrwsurh">
+      <w:hyperlink w:history="1" r:id="rIdsjauh5rkq7xycqwhokil1">
         <w:r>
           <w:rPr>
             <w:rStyle w:val="Hyperlink"/>
@@ -3039,7 +3039,7 @@
         </w:rPr>
         <w:t xml:space="preserve"> </w:t>
       </w:r>
-      <w:hyperlink w:history="1" r:id="rIdvrccz0gujaq3dofc-xzqm">
+      <w:hyperlink w:history="1" r:id="rIdd3wve6tz6q85-egb3y1xq">
         <w:r>
           <w:rPr>
             <w:rStyle w:val="Hyperlink"/>
@@ -3098,7 +3098,7 @@
         </w:rPr>
         <w:t xml:space="preserve"> </w:t>
       </w:r>
-      <w:hyperlink w:history="1" r:id="rId98egfktgnbrqvmdrgemsi">
+      <w:hyperlink w:history="1" r:id="rIdgb0lmxpqcefvg236mf6mv">
         <w:r>
           <w:rPr>
             <w:rStyle w:val="Hyperlink"/>
@@ -3175,7 +3175,7 @@
         </w:rPr>
         <w:t xml:space="preserve"> </w:t>
       </w:r>
-      <w:hyperlink w:history="1" r:id="rIdhj0vxp2r12pth5lhpqrwp">
+      <w:hyperlink w:history="1" r:id="rIdtsmdi5vdcbtj_o32wvljh">
         <w:r>
           <w:rPr>
             <w:rStyle w:val="Hyperlink"/>
@@ -3234,7 +3234,7 @@
         </w:rPr>
         <w:t xml:space="preserve"> </w:t>
       </w:r>
-      <w:hyperlink w:history="1" r:id="rIdcjzhb6cdmlyq-sgb1msov">
+      <w:hyperlink w:history="1" r:id="rIdaihxg0j2sax8pf4pjo-po">
         <w:r>
           <w:rPr>
             <w:rStyle w:val="Hyperlink"/>
@@ -3311,7 +3311,7 @@
         </w:rPr>
         <w:t xml:space="preserve"> </w:t>
       </w:r>
-      <w:hyperlink w:history="1" r:id="rIdxs_6ex3j7j8ka3yjaqhfb">
+      <w:hyperlink w:history="1" r:id="rIdo40xghg1kll1f3irgequj">
         <w:r>
           <w:rPr>
             <w:rStyle w:val="Hyperlink"/>
@@ -3370,7 +3370,7 @@
         </w:rPr>
         <w:t xml:space="preserve"> </w:t>
       </w:r>
-      <w:hyperlink w:history="1" r:id="rIdaaa2uergbalns8ed5vbx-">
+      <w:hyperlink w:history="1" r:id="rIdhpnp8zdthmortfvopo_5e">
         <w:r>
           <w:rPr>
             <w:rStyle w:val="Hyperlink"/>
@@ -3429,7 +3429,7 @@
         </w:rPr>
         <w:t xml:space="preserve"> </w:t>
       </w:r>
-      <w:hyperlink w:history="1" r:id="rIdfn5aauazudexm46w41gk6">
+      <w:hyperlink w:history="1" r:id="rIdbxyvvyv9uzoovi3f91fsc">
         <w:r>
           <w:rPr>
             <w:rStyle w:val="Hyperlink"/>

</xml_diff>